<commit_message>
Add GUI screenshots, fix README paths, update Word doc with TL currency
Co-Authored-By: Claude Sonnet 4.6 <noreply@anthropic.com>
</commit_message>
<xml_diff>
--- a/LED_PPFD_Project_Report.docx
+++ b/LED_PPFD_Project_Report.docx
@@ -744,7 +744,7 @@
               <w:rPr>
                 <w:sz w:val="20"/>
               </w:rPr>
-              <w:t>2.200 USD</w:t>
+              <w:t>2.200 TL</w:t>
             </w:r>
           </w:p>
         </w:tc>
@@ -814,7 +814,7 @@
               <w:rPr>
                 <w:sz w:val="20"/>
               </w:rPr>
-              <w:t>550 USD</w:t>
+              <w:t>550 TL</w:t>
             </w:r>
           </w:p>
         </w:tc>
@@ -884,7 +884,7 @@
               <w:rPr>
                 <w:sz w:val="20"/>
               </w:rPr>
-              <w:t>850 USD</w:t>
+              <w:t>850 TL</w:t>
             </w:r>
           </w:p>
         </w:tc>
@@ -4366,6 +4366,360 @@
     </w:p>
     <w:p>
       <w:pPr>
+        <w:pStyle w:val="Heading2"/>
+      </w:pPr>
+      <w:r>
+        <w:rPr>
+          <w:color w:val="2E75B6"/>
+        </w:rPr>
+        <w:t>9.1 Ozel LED Duzeni Ekran Goruntuleri</w:t>
+      </w:r>
+    </w:p>
+    <w:tbl>
+      <w:tblPr>
+        <w:tblStyle w:val="TableGrid"/>
+        <w:tblW w:type="auto" w:w="0"/>
+        <w:jc w:val="center"/>
+        <w:tblLook w:firstColumn="1" w:firstRow="1" w:lastColumn="0" w:lastRow="0" w:noHBand="0" w:noVBand="1" w:val="04A0"/>
+      </w:tblPr>
+      <w:tblGrid>
+        <w:gridCol w:w="4561"/>
+        <w:gridCol w:w="4561"/>
+      </w:tblGrid>
+      <w:tr>
+        <w:tc>
+          <w:tcPr>
+            <w:tcW w:type="dxa" w:w="4561"/>
+            <w:shd w:val="clear" w:color="auto" w:fill="FFFFFF"/>
+          </w:tcPr>
+          <w:p>
+            <w:pPr>
+              <w:jc w:val="center"/>
+            </w:pPr>
+            <w:r>
+              <w:drawing>
+                <wp:inline xmlns:a="http://schemas.openxmlformats.org/drawingml/2006/main" xmlns:pic="http://schemas.openxmlformats.org/drawingml/2006/picture">
+                  <wp:extent cx="2651760" cy="1403458"/>
+                  <wp:docPr id="9" name="Picture 9"/>
+                  <wp:cNvGraphicFramePr>
+                    <a:graphicFrameLocks noChangeAspect="1"/>
+                  </wp:cNvGraphicFramePr>
+                  <a:graphic>
+                    <a:graphicData uri="http://schemas.openxmlformats.org/drawingml/2006/picture">
+                      <pic:pic>
+                        <pic:nvPicPr>
+                          <pic:cNvPr id="0" name="custom_layout_3leds.png"/>
+                          <pic:cNvPicPr/>
+                        </pic:nvPicPr>
+                        <pic:blipFill>
+                          <a:blip r:embed="rId17"/>
+                          <a:stretch>
+                            <a:fillRect/>
+                          </a:stretch>
+                        </pic:blipFill>
+                        <pic:spPr>
+                          <a:xfrm>
+                            <a:off x="0" y="0"/>
+                            <a:ext cx="2651760" cy="1403458"/>
+                          </a:xfrm>
+                          <a:prstGeom prst="rect"/>
+                        </pic:spPr>
+                      </pic:pic>
+                    </a:graphicData>
+                  </a:graphic>
+                </wp:inline>
+              </w:drawing>
+            </w:r>
+          </w:p>
+        </w:tc>
+        <w:tc>
+          <w:tcPr>
+            <w:tcW w:type="dxa" w:w="4561"/>
+            <w:shd w:val="clear" w:color="auto" w:fill="FFFFFF"/>
+          </w:tcPr>
+          <w:p>
+            <w:pPr>
+              <w:jc w:val="center"/>
+            </w:pPr>
+            <w:r>
+              <w:drawing>
+                <wp:inline xmlns:a="http://schemas.openxmlformats.org/drawingml/2006/main" xmlns:pic="http://schemas.openxmlformats.org/drawingml/2006/picture">
+                  <wp:extent cx="2651760" cy="1418936"/>
+                  <wp:docPr id="10" name="Picture 10"/>
+                  <wp:cNvGraphicFramePr>
+                    <a:graphicFrameLocks noChangeAspect="1"/>
+                  </wp:cNvGraphicFramePr>
+                  <a:graphic>
+                    <a:graphicData uri="http://schemas.openxmlformats.org/drawingml/2006/picture">
+                      <pic:pic>
+                        <pic:nvPicPr>
+                          <pic:cNvPr id="0" name="custom_layout_heat_map_3_leds.png"/>
+                          <pic:cNvPicPr/>
+                        </pic:nvPicPr>
+                        <pic:blipFill>
+                          <a:blip r:embed="rId18"/>
+                          <a:stretch>
+                            <a:fillRect/>
+                          </a:stretch>
+                        </pic:blipFill>
+                        <pic:spPr>
+                          <a:xfrm>
+                            <a:off x="0" y="0"/>
+                            <a:ext cx="2651760" cy="1418936"/>
+                          </a:xfrm>
+                          <a:prstGeom prst="rect"/>
+                        </pic:spPr>
+                      </pic:pic>
+                    </a:graphicData>
+                  </a:graphic>
+                </wp:inline>
+              </w:drawing>
+            </w:r>
+          </w:p>
+        </w:tc>
+      </w:tr>
+      <w:tr>
+        <w:tc>
+          <w:tcPr>
+            <w:tcW w:type="dxa" w:w="4561"/>
+            <w:shd w:val="clear" w:color="auto" w:fill="FFFFFF"/>
+          </w:tcPr>
+          <w:p>
+            <w:pPr>
+              <w:jc w:val="center"/>
+            </w:pPr>
+            <w:r>
+              <w:rPr>
+                <w:i/>
+                <w:color w:val="606060"/>
+                <w:sz w:val="17"/>
+              </w:rPr>
+              <w:t>3x 54V LED kurulum duzeni</w:t>
+            </w:r>
+          </w:p>
+        </w:tc>
+        <w:tc>
+          <w:tcPr>
+            <w:tcW w:type="dxa" w:w="4561"/>
+            <w:shd w:val="clear" w:color="auto" w:fill="FFFFFF"/>
+          </w:tcPr>
+          <w:p>
+            <w:pPr>
+              <w:jc w:val="center"/>
+            </w:pPr>
+            <w:r>
+              <w:rPr>
+                <w:i/>
+                <w:color w:val="606060"/>
+                <w:sz w:val="17"/>
+              </w:rPr>
+              <w:t>3 LED PPFD isi haritasi</w:t>
+            </w:r>
+          </w:p>
+        </w:tc>
+      </w:tr>
+    </w:tbl>
+    <w:p/>
+    <w:tbl>
+      <w:tblPr>
+        <w:tblStyle w:val="TableGrid"/>
+        <w:tblW w:type="auto" w:w="0"/>
+        <w:jc w:val="center"/>
+        <w:tblLook w:firstColumn="1" w:firstRow="1" w:lastColumn="0" w:lastRow="0" w:noHBand="0" w:noVBand="1" w:val="04A0"/>
+      </w:tblPr>
+      <w:tblGrid>
+        <w:gridCol w:w="4561"/>
+        <w:gridCol w:w="4561"/>
+      </w:tblGrid>
+      <w:tr>
+        <w:tc>
+          <w:tcPr>
+            <w:tcW w:type="dxa" w:w="4561"/>
+            <w:shd w:val="clear" w:color="auto" w:fill="FFFFFF"/>
+          </w:tcPr>
+          <w:p>
+            <w:pPr>
+              <w:jc w:val="center"/>
+            </w:pPr>
+            <w:r>
+              <w:drawing>
+                <wp:inline xmlns:a="http://schemas.openxmlformats.org/drawingml/2006/main" xmlns:pic="http://schemas.openxmlformats.org/drawingml/2006/picture">
+                  <wp:extent cx="2651760" cy="1423237"/>
+                  <wp:docPr id="11" name="Picture 11"/>
+                  <wp:cNvGraphicFramePr>
+                    <a:graphicFrameLocks noChangeAspect="1"/>
+                  </wp:cNvGraphicFramePr>
+                  <a:graphic>
+                    <a:graphicData uri="http://schemas.openxmlformats.org/drawingml/2006/picture">
+                      <pic:pic>
+                        <pic:nvPicPr>
+                          <pic:cNvPr id="0" name="custom_layout_5_led.png"/>
+                          <pic:cNvPicPr/>
+                        </pic:nvPicPr>
+                        <pic:blipFill>
+                          <a:blip r:embed="rId19"/>
+                          <a:stretch>
+                            <a:fillRect/>
+                          </a:stretch>
+                        </pic:blipFill>
+                        <pic:spPr>
+                          <a:xfrm>
+                            <a:off x="0" y="0"/>
+                            <a:ext cx="2651760" cy="1423237"/>
+                          </a:xfrm>
+                          <a:prstGeom prst="rect"/>
+                        </pic:spPr>
+                      </pic:pic>
+                    </a:graphicData>
+                  </a:graphic>
+                </wp:inline>
+              </w:drawing>
+            </w:r>
+          </w:p>
+        </w:tc>
+        <w:tc>
+          <w:tcPr>
+            <w:tcW w:type="dxa" w:w="4561"/>
+            <w:shd w:val="clear" w:color="auto" w:fill="FFFFFF"/>
+          </w:tcPr>
+          <w:p>
+            <w:pPr>
+              <w:jc w:val="center"/>
+            </w:pPr>
+            <w:r>
+              <w:drawing>
+                <wp:inline xmlns:a="http://schemas.openxmlformats.org/drawingml/2006/main" xmlns:pic="http://schemas.openxmlformats.org/drawingml/2006/picture">
+                  <wp:extent cx="2651760" cy="1427437"/>
+                  <wp:docPr id="12" name="Picture 12"/>
+                  <wp:cNvGraphicFramePr>
+                    <a:graphicFrameLocks noChangeAspect="1"/>
+                  </wp:cNvGraphicFramePr>
+                  <a:graphic>
+                    <a:graphicData uri="http://schemas.openxmlformats.org/drawingml/2006/picture">
+                      <pic:pic>
+                        <pic:nvPicPr>
+                          <pic:cNvPr id="0" name="custom_layout_5_led_heat_map.png"/>
+                          <pic:cNvPicPr/>
+                        </pic:nvPicPr>
+                        <pic:blipFill>
+                          <a:blip r:embed="rId20"/>
+                          <a:stretch>
+                            <a:fillRect/>
+                          </a:stretch>
+                        </pic:blipFill>
+                        <pic:spPr>
+                          <a:xfrm>
+                            <a:off x="0" y="0"/>
+                            <a:ext cx="2651760" cy="1427437"/>
+                          </a:xfrm>
+                          <a:prstGeom prst="rect"/>
+                        </pic:spPr>
+                      </pic:pic>
+                    </a:graphicData>
+                  </a:graphic>
+                </wp:inline>
+              </w:drawing>
+            </w:r>
+          </w:p>
+        </w:tc>
+      </w:tr>
+      <w:tr>
+        <w:tc>
+          <w:tcPr>
+            <w:tcW w:type="dxa" w:w="4561"/>
+            <w:shd w:val="clear" w:color="auto" w:fill="FFFFFF"/>
+          </w:tcPr>
+          <w:p>
+            <w:pPr>
+              <w:jc w:val="center"/>
+            </w:pPr>
+            <w:r>
+              <w:rPr>
+                <w:i/>
+                <w:color w:val="606060"/>
+                <w:sz w:val="17"/>
+              </w:rPr>
+              <w:t>5 LED karisik kurulum (Quantum + 54V)</w:t>
+            </w:r>
+          </w:p>
+        </w:tc>
+        <w:tc>
+          <w:tcPr>
+            <w:tcW w:type="dxa" w:w="4561"/>
+            <w:shd w:val="clear" w:color="auto" w:fill="FFFFFF"/>
+          </w:tcPr>
+          <w:p>
+            <w:pPr>
+              <w:jc w:val="center"/>
+            </w:pPr>
+            <w:r>
+              <w:rPr>
+                <w:i/>
+                <w:color w:val="606060"/>
+                <w:sz w:val="17"/>
+              </w:rPr>
+              <w:t>5 LED PPFD dagilimi</w:t>
+            </w:r>
+          </w:p>
+        </w:tc>
+      </w:tr>
+    </w:tbl>
+    <w:p/>
+    <w:p>
+      <w:pPr>
+        <w:jc w:val="center"/>
+      </w:pPr>
+      <w:r>
+        <w:drawing>
+          <wp:inline xmlns:a="http://schemas.openxmlformats.org/drawingml/2006/main" xmlns:pic="http://schemas.openxmlformats.org/drawingml/2006/picture">
+            <wp:extent cx="5029200" cy="2133681"/>
+            <wp:docPr id="13" name="Picture 13"/>
+            <wp:cNvGraphicFramePr>
+              <a:graphicFrameLocks noChangeAspect="1"/>
+            </wp:cNvGraphicFramePr>
+            <a:graphic>
+              <a:graphicData uri="http://schemas.openxmlformats.org/drawingml/2006/picture">
+                <pic:pic>
+                  <pic:nvPicPr>
+                    <pic:cNvPr id="0" name="custom_layout_3_led_statistics.png"/>
+                    <pic:cNvPicPr/>
+                  </pic:nvPicPr>
+                  <pic:blipFill>
+                    <a:blip r:embed="rId21"/>
+                    <a:stretch>
+                      <a:fillRect/>
+                    </a:stretch>
+                  </pic:blipFill>
+                  <pic:spPr>
+                    <a:xfrm>
+                      <a:off x="0" y="0"/>
+                      <a:ext cx="5029200" cy="2133681"/>
+                    </a:xfrm>
+                    <a:prstGeom prst="rect"/>
+                  </pic:spPr>
+                </pic:pic>
+              </a:graphicData>
+            </a:graphic>
+          </wp:inline>
+        </w:drawing>
+      </w:r>
+    </w:p>
+    <w:p>
+      <w:pPr>
+        <w:spacing w:after="160"/>
+        <w:jc w:val="center"/>
+      </w:pPr>
+      <w:r>
+        <w:rPr>
+          <w:i/>
+          <w:color w:val="606060"/>
+          <w:sz w:val="18"/>
+        </w:rPr>
+        <w:t>Istatistik paneli — 3x 54V LED kurulumu</w:t>
+      </w:r>
+    </w:p>
+    <w:p>
+      <w:pPr>
         <w:pStyle w:val="Heading1"/>
       </w:pPr>
       <w:r>
@@ -4813,7 +5167,7 @@
       </w:r>
     </w:p>
     <w:sectPr>
-      <w:footerReference w:type="default" r:id="rId17"/>
+      <w:footerReference w:type="default" r:id="rId22"/>
       <w:pgSz w:w="12240" w:h="15840"/>
       <w:pgMar w:top="1417" w:right="1417" w:bottom="1417" w:left="1701" w:header="720" w:footer="720" w:gutter="0"/>
       <w:cols w:space="720"/>

</xml_diff>

<commit_message>
Add measurement data heatmaps for all LED types and heights
- generate_measurement_heatmaps.py: interpolated PPFD heatmaps with actual values overlaid
- 7 figures: per LED type (3), per height (3), full 3x3 summary grid
- README: new section with 3 heatmap figures in Veri Seti
- Word: measurement visualization section with 3 figures

Co-Authored-By: Claude Sonnet 4.6 <noreply@anthropic.com>
</commit_message>
<xml_diff>
--- a/LED_PPFD_Project_Report.docx
+++ b/LED_PPFD_Project_Report.docx
@@ -1178,6 +1178,189 @@
     </w:p>
     <w:p>
       <w:pPr>
+        <w:pStyle w:val="Heading2"/>
+      </w:pPr>
+      <w:r>
+        <w:rPr>
+          <w:color w:val="2E75B6"/>
+        </w:rPr>
+        <w:t>4.3 Olcum Verisi Gorsellestirmesi</w:t>
+      </w:r>
+    </w:p>
+    <w:p>
+      <w:pPr>
+        <w:spacing w:after="80"/>
+      </w:pPr>
+      <w:r>
+        <w:rPr>
+          <w:b w:val="0"/>
+          <w:i w:val="0"/>
+          <w:sz w:val="22"/>
+        </w:rPr>
+        <w:t>Asagidaki isi haritalari gercek olcum noktalarindaki PPFD degerlerini gostermektedir. Her kutu bir olcum noktasini, icerisindeki deger o noktadaki PPFD'yi (umol/m2/s) temsil eder. Arka plan rengi scipy griddata interpolasyonu ile olusturulmustur.</w:t>
+      </w:r>
+    </w:p>
+    <w:p>
+      <w:pPr>
+        <w:jc w:val="center"/>
+      </w:pPr>
+      <w:r>
+        <w:drawing>
+          <wp:inline xmlns:a="http://schemas.openxmlformats.org/drawingml/2006/main" xmlns:pic="http://schemas.openxmlformats.org/drawingml/2006/picture">
+            <wp:extent cx="5669280" cy="2019951"/>
+            <wp:docPr id="5" name="Picture 5"/>
+            <wp:cNvGraphicFramePr>
+              <a:graphicFrameLocks noChangeAspect="1"/>
+            </wp:cNvGraphicFramePr>
+            <a:graphic>
+              <a:graphicData uri="http://schemas.openxmlformats.org/drawingml/2006/picture">
+                <pic:pic>
+                  <pic:nvPicPr>
+                    <pic:cNvPr id="0" name="measurement_heatmap_quantum.png"/>
+                    <pic:cNvPicPr/>
+                  </pic:nvPicPr>
+                  <pic:blipFill>
+                    <a:blip r:embed="rId13"/>
+                    <a:stretch>
+                      <a:fillRect/>
+                    </a:stretch>
+                  </pic:blipFill>
+                  <pic:spPr>
+                    <a:xfrm>
+                      <a:off x="0" y="0"/>
+                      <a:ext cx="5669280" cy="2019951"/>
+                    </a:xfrm>
+                    <a:prstGeom prst="rect"/>
+                  </pic:spPr>
+                </pic:pic>
+              </a:graphicData>
+            </a:graphic>
+          </wp:inline>
+        </w:drawing>
+      </w:r>
+    </w:p>
+    <w:p>
+      <w:pPr>
+        <w:spacing w:after="160"/>
+        <w:jc w:val="center"/>
+      </w:pPr>
+      <w:r>
+        <w:rPr>
+          <w:i/>
+          <w:color w:val="606060"/>
+          <w:sz w:val="18"/>
+        </w:rPr>
+        <w:t>Quantum LED -- Uclu Yukseklik Karsilastirmasi (Olculen PPFD Dagilimi)</w:t>
+      </w:r>
+    </w:p>
+    <w:p>
+      <w:pPr>
+        <w:jc w:val="center"/>
+      </w:pPr>
+      <w:r>
+        <w:drawing>
+          <wp:inline xmlns:a="http://schemas.openxmlformats.org/drawingml/2006/main" xmlns:pic="http://schemas.openxmlformats.org/drawingml/2006/picture">
+            <wp:extent cx="5669280" cy="2019951"/>
+            <wp:docPr id="6" name="Picture 6"/>
+            <wp:cNvGraphicFramePr>
+              <a:graphicFrameLocks noChangeAspect="1"/>
+            </wp:cNvGraphicFramePr>
+            <a:graphic>
+              <a:graphicData uri="http://schemas.openxmlformats.org/drawingml/2006/picture">
+                <pic:pic>
+                  <pic:nvPicPr>
+                    <pic:cNvPr id="0" name="measurement_heatmap_h13cm.png"/>
+                    <pic:cNvPicPr/>
+                  </pic:nvPicPr>
+                  <pic:blipFill>
+                    <a:blip r:embed="rId14"/>
+                    <a:stretch>
+                      <a:fillRect/>
+                    </a:stretch>
+                  </pic:blipFill>
+                  <pic:spPr>
+                    <a:xfrm>
+                      <a:off x="0" y="0"/>
+                      <a:ext cx="5669280" cy="2019951"/>
+                    </a:xfrm>
+                    <a:prstGeom prst="rect"/>
+                  </pic:spPr>
+                </pic:pic>
+              </a:graphicData>
+            </a:graphic>
+          </wp:inline>
+        </w:drawing>
+      </w:r>
+    </w:p>
+    <w:p>
+      <w:pPr>
+        <w:spacing w:after="160"/>
+        <w:jc w:val="center"/>
+      </w:pPr>
+      <w:r>
+        <w:rPr>
+          <w:i/>
+          <w:color w:val="606060"/>
+          <w:sz w:val="18"/>
+        </w:rPr>
+        <w:t>Tum LED Tipleri -- 13 cm Yukseklik (Olculen PPFD Karsilastirmasi)</w:t>
+      </w:r>
+    </w:p>
+    <w:p>
+      <w:pPr>
+        <w:jc w:val="center"/>
+      </w:pPr>
+      <w:r>
+        <w:drawing>
+          <wp:inline xmlns:a="http://schemas.openxmlformats.org/drawingml/2006/main" xmlns:pic="http://schemas.openxmlformats.org/drawingml/2006/picture">
+            <wp:extent cx="5943600" cy="5104473"/>
+            <wp:docPr id="7" name="Picture 7"/>
+            <wp:cNvGraphicFramePr>
+              <a:graphicFrameLocks noChangeAspect="1"/>
+            </wp:cNvGraphicFramePr>
+            <a:graphic>
+              <a:graphicData uri="http://schemas.openxmlformats.org/drawingml/2006/picture">
+                <pic:pic>
+                  <pic:nvPicPr>
+                    <pic:cNvPr id="0" name="measurement_heatmap_all.png"/>
+                    <pic:cNvPicPr/>
+                  </pic:nvPicPr>
+                  <pic:blipFill>
+                    <a:blip r:embed="rId15"/>
+                    <a:stretch>
+                      <a:fillRect/>
+                    </a:stretch>
+                  </pic:blipFill>
+                  <pic:spPr>
+                    <a:xfrm>
+                      <a:off x="0" y="0"/>
+                      <a:ext cx="5943600" cy="5104473"/>
+                    </a:xfrm>
+                    <a:prstGeom prst="rect"/>
+                  </pic:spPr>
+                </pic:pic>
+              </a:graphicData>
+            </a:graphic>
+          </wp:inline>
+        </w:drawing>
+      </w:r>
+    </w:p>
+    <w:p>
+      <w:pPr>
+        <w:spacing w:after="160"/>
+        <w:jc w:val="center"/>
+      </w:pPr>
+      <w:r>
+        <w:rPr>
+          <w:i/>
+          <w:color w:val="606060"/>
+          <w:sz w:val="18"/>
+        </w:rPr>
+        <w:t>Tum LED Tipleri x Tum Yukseklikler -- PPFD Olcum Ozeti (3x3)</w:t>
+      </w:r>
+    </w:p>
+    <w:p>
+      <w:pPr>
         <w:pStyle w:val="Heading1"/>
       </w:pPr>
       <w:r>
@@ -1619,7 +1802,7 @@
         <w:drawing>
           <wp:inline xmlns:a="http://schemas.openxmlformats.org/drawingml/2006/main" xmlns:pic="http://schemas.openxmlformats.org/drawingml/2006/picture">
             <wp:extent cx="5486400" cy="1577468"/>
-            <wp:docPr id="5" name="Picture 5"/>
+            <wp:docPr id="8" name="Picture 8"/>
             <wp:cNvGraphicFramePr>
               <a:graphicFrameLocks noChangeAspect="1"/>
             </wp:cNvGraphicFramePr>
@@ -1631,7 +1814,7 @@
                     <pic:cNvPicPr/>
                   </pic:nvPicPr>
                   <pic:blipFill>
-                    <a:blip r:embed="rId13"/>
+                    <a:blip r:embed="rId16"/>
                     <a:stretch>
                       <a:fillRect/>
                     </a:stretch>
@@ -2306,7 +2489,7 @@
         <w:drawing>
           <wp:inline xmlns:a="http://schemas.openxmlformats.org/drawingml/2006/main" xmlns:pic="http://schemas.openxmlformats.org/drawingml/2006/picture">
             <wp:extent cx="5486400" cy="4014100"/>
-            <wp:docPr id="6" name="Picture 6"/>
+            <wp:docPr id="9" name="Picture 9"/>
             <wp:cNvGraphicFramePr>
               <a:graphicFrameLocks noChangeAspect="1"/>
             </wp:cNvGraphicFramePr>
@@ -2318,7 +2501,7 @@
                     <pic:cNvPicPr/>
                   </pic:nvPicPr>
                   <pic:blipFill>
-                    <a:blip r:embed="rId14"/>
+                    <a:blip r:embed="rId17"/>
                     <a:stretch>
                       <a:fillRect/>
                     </a:stretch>
@@ -3140,7 +3323,7 @@
         <w:drawing>
           <wp:inline xmlns:a="http://schemas.openxmlformats.org/drawingml/2006/main" xmlns:pic="http://schemas.openxmlformats.org/drawingml/2006/picture">
             <wp:extent cx="5486400" cy="1577468"/>
-            <wp:docPr id="7" name="Picture 7"/>
+            <wp:docPr id="10" name="Picture 10"/>
             <wp:cNvGraphicFramePr>
               <a:graphicFrameLocks noChangeAspect="1"/>
             </wp:cNvGraphicFramePr>
@@ -3152,7 +3335,7 @@
                     <pic:cNvPicPr/>
                   </pic:nvPicPr>
                   <pic:blipFill>
-                    <a:blip r:embed="rId15"/>
+                    <a:blip r:embed="rId18"/>
                     <a:stretch>
                       <a:fillRect/>
                     </a:stretch>
@@ -3193,7 +3376,7 @@
         <w:drawing>
           <wp:inline xmlns:a="http://schemas.openxmlformats.org/drawingml/2006/main" xmlns:pic="http://schemas.openxmlformats.org/drawingml/2006/picture">
             <wp:extent cx="5486400" cy="1577468"/>
-            <wp:docPr id="8" name="Picture 8"/>
+            <wp:docPr id="11" name="Picture 11"/>
             <wp:cNvGraphicFramePr>
               <a:graphicFrameLocks noChangeAspect="1"/>
             </wp:cNvGraphicFramePr>
@@ -3205,7 +3388,7 @@
                     <pic:cNvPicPr/>
                   </pic:nvPicPr>
                   <pic:blipFill>
-                    <a:blip r:embed="rId16"/>
+                    <a:blip r:embed="rId19"/>
                     <a:stretch>
                       <a:fillRect/>
                     </a:stretch>
@@ -4400,7 +4583,7 @@
               <w:drawing>
                 <wp:inline xmlns:a="http://schemas.openxmlformats.org/drawingml/2006/main" xmlns:pic="http://schemas.openxmlformats.org/drawingml/2006/picture">
                   <wp:extent cx="2651760" cy="1403458"/>
-                  <wp:docPr id="9" name="Picture 9"/>
+                  <wp:docPr id="12" name="Picture 12"/>
                   <wp:cNvGraphicFramePr>
                     <a:graphicFrameLocks noChangeAspect="1"/>
                   </wp:cNvGraphicFramePr>
@@ -4412,7 +4595,7 @@
                           <pic:cNvPicPr/>
                         </pic:nvPicPr>
                         <pic:blipFill>
-                          <a:blip r:embed="rId17"/>
+                          <a:blip r:embed="rId20"/>
                           <a:stretch>
                             <a:fillRect/>
                           </a:stretch>
@@ -4445,7 +4628,7 @@
               <w:drawing>
                 <wp:inline xmlns:a="http://schemas.openxmlformats.org/drawingml/2006/main" xmlns:pic="http://schemas.openxmlformats.org/drawingml/2006/picture">
                   <wp:extent cx="2651760" cy="1418936"/>
-                  <wp:docPr id="10" name="Picture 10"/>
+                  <wp:docPr id="13" name="Picture 13"/>
                   <wp:cNvGraphicFramePr>
                     <a:graphicFrameLocks noChangeAspect="1"/>
                   </wp:cNvGraphicFramePr>
@@ -4457,7 +4640,7 @@
                           <pic:cNvPicPr/>
                         </pic:nvPicPr>
                         <pic:blipFill>
-                          <a:blip r:embed="rId18"/>
+                          <a:blip r:embed="rId21"/>
                           <a:stretch>
                             <a:fillRect/>
                           </a:stretch>
@@ -4545,7 +4728,7 @@
               <w:drawing>
                 <wp:inline xmlns:a="http://schemas.openxmlformats.org/drawingml/2006/main" xmlns:pic="http://schemas.openxmlformats.org/drawingml/2006/picture">
                   <wp:extent cx="2651760" cy="1423237"/>
-                  <wp:docPr id="11" name="Picture 11"/>
+                  <wp:docPr id="14" name="Picture 14"/>
                   <wp:cNvGraphicFramePr>
                     <a:graphicFrameLocks noChangeAspect="1"/>
                   </wp:cNvGraphicFramePr>
@@ -4557,7 +4740,7 @@
                           <pic:cNvPicPr/>
                         </pic:nvPicPr>
                         <pic:blipFill>
-                          <a:blip r:embed="rId19"/>
+                          <a:blip r:embed="rId22"/>
                           <a:stretch>
                             <a:fillRect/>
                           </a:stretch>
@@ -4590,7 +4773,7 @@
               <w:drawing>
                 <wp:inline xmlns:a="http://schemas.openxmlformats.org/drawingml/2006/main" xmlns:pic="http://schemas.openxmlformats.org/drawingml/2006/picture">
                   <wp:extent cx="2651760" cy="1427437"/>
-                  <wp:docPr id="12" name="Picture 12"/>
+                  <wp:docPr id="15" name="Picture 15"/>
                   <wp:cNvGraphicFramePr>
                     <a:graphicFrameLocks noChangeAspect="1"/>
                   </wp:cNvGraphicFramePr>
@@ -4602,7 +4785,7 @@
                           <pic:cNvPicPr/>
                         </pic:nvPicPr>
                         <pic:blipFill>
-                          <a:blip r:embed="rId20"/>
+                          <a:blip r:embed="rId23"/>
                           <a:stretch>
                             <a:fillRect/>
                           </a:stretch>
@@ -4673,7 +4856,7 @@
         <w:drawing>
           <wp:inline xmlns:a="http://schemas.openxmlformats.org/drawingml/2006/main" xmlns:pic="http://schemas.openxmlformats.org/drawingml/2006/picture">
             <wp:extent cx="5029200" cy="2133681"/>
-            <wp:docPr id="13" name="Picture 13"/>
+            <wp:docPr id="16" name="Picture 16"/>
             <wp:cNvGraphicFramePr>
               <a:graphicFrameLocks noChangeAspect="1"/>
             </wp:cNvGraphicFramePr>
@@ -4685,7 +4868,7 @@
                     <pic:cNvPicPr/>
                   </pic:nvPicPr>
                   <pic:blipFill>
-                    <a:blip r:embed="rId21"/>
+                    <a:blip r:embed="rId24"/>
                     <a:stretch>
                       <a:fillRect/>
                     </a:stretch>
@@ -5167,7 +5350,7 @@
       </w:r>
     </w:p>
     <w:sectPr>
-      <w:footerReference w:type="default" r:id="rId22"/>
+      <w:footerReference w:type="default" r:id="rId25"/>
       <w:pgSz w:w="12240" w:h="15840"/>
       <w:pgMar w:top="1417" w:right="1417" w:bottom="1417" w:left="1701" w:header="720" w:footer="720" w:gutter="0"/>
       <w:cols w:space="720"/>

</xml_diff>